<commit_message>
Archive ATB-2026-29 companion DOCX/PDF and rebuild 2026 master index
Run tools/atb_publish/publish_atb.py for this week's issue: builds the
DOCX + PDF companions, copies the source HTML into ATB Archive/2026/
ATB-2026-29/, and rebuilds the year's master index. QA passed with no
errors or warnings. Google Drive sync was skipped (no service-account
credentials configured in this environment) -- the archive is complete
locally; someone with Drive credentials can re-run sync_google_drive.py.

Co-Authored-By: Claude Sonnet 5 <noreply@anthropic.com>
</commit_message>
<xml_diff>
--- a/ATB Archive/2026/Alamo_Threat_Brief_2026_Master_Index.docx
+++ b/ATB Archive/2026/Alamo_Threat_Brief_2026_Master_Index.docx
@@ -38,7 +38,7 @@
           <w:color w:val="7A5A1E"/>
           <w:sz w:val="19"/>
         </w:rPr>
-        <w:t>Total issues: 26   |   First issue: 2026-03-16   |   Latest issue: 2026-09-06   |   Archive generated: 2026-09-19</w:t>
+        <w:t>Total issues: 27   |   First issue: 2026-03-16   |   Latest issue: 2026-09-27   |   Archive generated: 2026-09-26</w:t>
       </w:r>
     </w:p>
     <w:p/>
@@ -3861,6 +3861,148 @@
           </w:p>
         </w:tc>
       </w:tr>
+      <w:tr>
+        <w:tc>
+          <w:tcPr>
+            <w:tcW w:type="dxa" w:w="1474"/>
+            <w:tcBorders>
+              <w:top w:val="single" w:sz="4" w:color="CCCCCC"/>
+              <w:left w:val="single" w:sz="4" w:color="CCCCCC"/>
+              <w:bottom w:val="single" w:sz="4" w:color="CCCCCC"/>
+              <w:right w:val="single" w:sz="4" w:color="CCCCCC"/>
+            </w:tcBorders>
+          </w:tcPr>
+          <w:p>
+            <w:r>
+              <w:rPr>
+                <w:color w:val="142233"/>
+                <w:sz w:val="17"/>
+              </w:rPr>
+              <w:t>ATB-2026-29</w:t>
+            </w:r>
+          </w:p>
+        </w:tc>
+        <w:tc>
+          <w:tcPr>
+            <w:tcW w:type="dxa" w:w="2551"/>
+            <w:tcBorders>
+              <w:top w:val="single" w:sz="4" w:color="CCCCCC"/>
+              <w:left w:val="single" w:sz="4" w:color="CCCCCC"/>
+              <w:bottom w:val="single" w:sz="4" w:color="CCCCCC"/>
+              <w:right w:val="single" w:sz="4" w:color="CCCCCC"/>
+            </w:tcBorders>
+          </w:tcPr>
+          <w:p>
+            <w:r>
+              <w:rPr>
+                <w:color w:val="142233"/>
+                <w:sz w:val="17"/>
+              </w:rPr>
+              <w:t>21–27 SEP 2026</w:t>
+            </w:r>
+          </w:p>
+        </w:tc>
+        <w:tc>
+          <w:tcPr>
+            <w:tcW w:type="dxa" w:w="1474"/>
+            <w:tcBorders>
+              <w:top w:val="single" w:sz="4" w:color="CCCCCC"/>
+              <w:left w:val="single" w:sz="4" w:color="CCCCCC"/>
+              <w:bottom w:val="single" w:sz="4" w:color="CCCCCC"/>
+              <w:right w:val="single" w:sz="4" w:color="CCCCCC"/>
+            </w:tcBorders>
+          </w:tcPr>
+          <w:p>
+            <w:r>
+              <w:rPr>
+                <w:color w:val="142233"/>
+                <w:sz w:val="17"/>
+              </w:rPr>
+              <w:t>2026-09-27</w:t>
+            </w:r>
+          </w:p>
+        </w:tc>
+        <w:tc>
+          <w:tcPr>
+            <w:tcW w:type="dxa" w:w="5386"/>
+            <w:tcBorders>
+              <w:top w:val="single" w:sz="4" w:color="CCCCCC"/>
+              <w:left w:val="single" w:sz="4" w:color="CCCCCC"/>
+              <w:bottom w:val="single" w:sz="4" w:color="CCCCCC"/>
+              <w:right w:val="single" w:sz="4" w:color="CCCCCC"/>
+            </w:tcBorders>
+          </w:tcPr>
+          <w:p>
+            <w:r>
+              <w:rPr>
+                <w:color w:val="142233"/>
+                <w:sz w:val="17"/>
+              </w:rPr>
+              <w:t>YOUR INTEGRATOR MAY KNOW YOUR OPERATION BETTER THAN YOU DO</w:t>
+            </w:r>
+          </w:p>
+        </w:tc>
+        <w:tc>
+          <w:tcPr>
+            <w:tcW w:type="dxa" w:w="1587"/>
+            <w:tcBorders>
+              <w:top w:val="single" w:sz="4" w:color="CCCCCC"/>
+              <w:left w:val="single" w:sz="4" w:color="CCCCCC"/>
+              <w:bottom w:val="single" w:sz="4" w:color="CCCCCC"/>
+              <w:right w:val="single" w:sz="4" w:color="CCCCCC"/>
+            </w:tcBorders>
+          </w:tcPr>
+          <w:p>
+            <w:r>
+              <w:rPr>
+                <w:color w:val="142233"/>
+                <w:sz w:val="17"/>
+              </w:rPr>
+              <w:t>ATB-2026-29_2026-09-27_YOUR_INTEGRATOR_MAY_KNOW_YOUR_OPERATION_BETTER_THAN.docx</w:t>
+            </w:r>
+          </w:p>
+        </w:tc>
+        <w:tc>
+          <w:tcPr>
+            <w:tcW w:type="dxa" w:w="1587"/>
+            <w:tcBorders>
+              <w:top w:val="single" w:sz="4" w:color="CCCCCC"/>
+              <w:left w:val="single" w:sz="4" w:color="CCCCCC"/>
+              <w:bottom w:val="single" w:sz="4" w:color="CCCCCC"/>
+              <w:right w:val="single" w:sz="4" w:color="CCCCCC"/>
+            </w:tcBorders>
+          </w:tcPr>
+          <w:p>
+            <w:r>
+              <w:rPr>
+                <w:color w:val="142233"/>
+                <w:sz w:val="17"/>
+              </w:rPr>
+              <w:t>ATB-2026-29_2026-09-27_YOUR_INTEGRATOR_MAY_KNOW_YOUR_OPERATION_BETTER_THAN.pdf</w:t>
+            </w:r>
+          </w:p>
+        </w:tc>
+        <w:tc>
+          <w:tcPr>
+            <w:tcW w:type="dxa" w:w="1814"/>
+            <w:tcBorders>
+              <w:top w:val="single" w:sz="4" w:color="CCCCCC"/>
+              <w:left w:val="single" w:sz="4" w:color="CCCCCC"/>
+              <w:bottom w:val="single" w:sz="4" w:color="CCCCCC"/>
+              <w:right w:val="single" w:sz="4" w:color="CCCCCC"/>
+            </w:tcBorders>
+          </w:tcPr>
+          <w:p>
+            <w:r>
+              <w:rPr>
+                <w:color w:val="142233"/>
+                <w:sz w:val="17"/>
+              </w:rPr>
+              <w:t>2026-09-27_source.html</w:t>
+            </w:r>
+          </w:p>
+        </w:tc>
+      </w:tr>
     </w:tbl>
     <w:sectPr>
       <w:pgSz w:w="16838" w:h="11906" w:orient="landscape"/>

</xml_diff>

<commit_message>
Rebuild ATB Word/PDF archive for all 2026 issues; add sync rule
Re-run tools/atb_publish/archive_all.py so every issue's archived source
HTML, DOCX, and PDF match the current pages (including the trademark
titles), and rebuild the 2026 master index. ATB-2026-27 and -28 had never
been archived and are added. All 29 issues pass QA; Drive sync skipped
(no credentials in this environment).

CLAUDE.md: standing rule to rebuild companions whenever an issue's HTML
changes.

Co-Authored-By: Claude Opus 5.5 <noreply@anthropic.com>
Claude-Session: https://claude.ai/code/session_0129mmzSzi3JfS6WRDf9LUVB
</commit_message>
<xml_diff>
--- a/ATB Archive/2026/Alamo_Threat_Brief_2026_Master_Index.docx
+++ b/ATB Archive/2026/Alamo_Threat_Brief_2026_Master_Index.docx
@@ -38,7 +38,7 @@
           <w:color w:val="7A5A1E"/>
           <w:sz w:val="19"/>
         </w:rPr>
-        <w:t>Total issues: 27   |   First issue: 2026-03-16   |   Latest issue: 2026-09-27   |   Archive generated: 2026-09-27</w:t>
+        <w:t>Total issues: 29   |   First issue: 2026-03-16   |   Latest issue: 2026-09-27   |   Archive generated: 2026-09-27</w:t>
       </w:r>
     </w:p>
     <w:p/>
@@ -248,7 +248,7 @@
                 <w:color w:val="142233"/>
                 <w:sz w:val="17"/>
               </w:rPr>
-              <w:t>The Alamo Threat Brief | Liberty CTI — 16 March 2026</w:t>
+              <w:t>The Alamo Threat Brief™ | Liberty CTI — 16 March 2026</w:t>
             </w:r>
           </w:p>
         </w:tc>
@@ -389,7 +389,7 @@
                 <w:color w:val="142233"/>
                 <w:sz w:val="17"/>
               </w:rPr>
-              <w:t>Alamo Threat Brief | 22 March 2026 | Liberty CTI</w:t>
+              <w:t>Alamo Threat Brief™ | 22 March 2026 | Liberty CTI</w:t>
             </w:r>
           </w:p>
         </w:tc>
@@ -530,7 +530,7 @@
                 <w:color w:val="142233"/>
                 <w:sz w:val="17"/>
               </w:rPr>
-              <w:t>Alamo Threat Brief ATB-2026-3 | 29 March 2026 | Liberty CTI</w:t>
+              <w:t>Alamo Threat Brief™ ATB-2026-3 | 29 March 2026 | Liberty CTI</w:t>
             </w:r>
           </w:p>
         </w:tc>
@@ -672,7 +672,7 @@
                 <w:color w:val="142233"/>
                 <w:sz w:val="17"/>
               </w:rPr>
-              <w:t>Alamo Threat Brief — ATB-2026-4 | Liberty CTI</w:t>
+              <w:t>Alamo Threat Brief™ — ATB-2026-4 | Liberty CTI</w:t>
             </w:r>
           </w:p>
         </w:tc>
@@ -3878,6 +3878,290 @@
                 <w:color w:val="142233"/>
                 <w:sz w:val="17"/>
               </w:rPr>
+              <w:t>ATB-2026-27</w:t>
+            </w:r>
+          </w:p>
+        </w:tc>
+        <w:tc>
+          <w:tcPr>
+            <w:tcW w:type="dxa" w:w="2551"/>
+            <w:tcBorders>
+              <w:top w:val="single" w:sz="4" w:color="CCCCCC"/>
+              <w:left w:val="single" w:sz="4" w:color="CCCCCC"/>
+              <w:bottom w:val="single" w:sz="4" w:color="CCCCCC"/>
+              <w:right w:val="single" w:sz="4" w:color="CCCCCC"/>
+            </w:tcBorders>
+          </w:tcPr>
+          <w:p>
+            <w:r>
+              <w:rPr>
+                <w:color w:val="142233"/>
+                <w:sz w:val="17"/>
+              </w:rPr>
+              <w:t>7–13 SEP 2026</w:t>
+            </w:r>
+          </w:p>
+        </w:tc>
+        <w:tc>
+          <w:tcPr>
+            <w:tcW w:type="dxa" w:w="1474"/>
+            <w:tcBorders>
+              <w:top w:val="single" w:sz="4" w:color="CCCCCC"/>
+              <w:left w:val="single" w:sz="4" w:color="CCCCCC"/>
+              <w:bottom w:val="single" w:sz="4" w:color="CCCCCC"/>
+              <w:right w:val="single" w:sz="4" w:color="CCCCCC"/>
+            </w:tcBorders>
+          </w:tcPr>
+          <w:p>
+            <w:r>
+              <w:rPr>
+                <w:color w:val="142233"/>
+                <w:sz w:val="17"/>
+              </w:rPr>
+              <w:t>2026-09-13</w:t>
+            </w:r>
+          </w:p>
+        </w:tc>
+        <w:tc>
+          <w:tcPr>
+            <w:tcW w:type="dxa" w:w="5386"/>
+            <w:tcBorders>
+              <w:top w:val="single" w:sz="4" w:color="CCCCCC"/>
+              <w:left w:val="single" w:sz="4" w:color="CCCCCC"/>
+              <w:bottom w:val="single" w:sz="4" w:color="CCCCCC"/>
+              <w:right w:val="single" w:sz="4" w:color="CCCCCC"/>
+            </w:tcBorders>
+          </w:tcPr>
+          <w:p>
+            <w:r>
+              <w:rPr>
+                <w:color w:val="142233"/>
+                <w:sz w:val="17"/>
+              </w:rPr>
+              <w:t>AI BECOMES BOTH COLLECTION TARGET AND ATTACK PLATFORM</w:t>
+            </w:r>
+          </w:p>
+        </w:tc>
+        <w:tc>
+          <w:tcPr>
+            <w:tcW w:type="dxa" w:w="1587"/>
+            <w:tcBorders>
+              <w:top w:val="single" w:sz="4" w:color="CCCCCC"/>
+              <w:left w:val="single" w:sz="4" w:color="CCCCCC"/>
+              <w:bottom w:val="single" w:sz="4" w:color="CCCCCC"/>
+              <w:right w:val="single" w:sz="4" w:color="CCCCCC"/>
+            </w:tcBorders>
+          </w:tcPr>
+          <w:p>
+            <w:r>
+              <w:rPr>
+                <w:color w:val="142233"/>
+                <w:sz w:val="17"/>
+              </w:rPr>
+              <w:t>ATB-2026-27_2026-09-13_AI_BECOMES_BOTH_COLLECTION_TARGET_AND_ATTACK_PLATFORM.docx</w:t>
+            </w:r>
+          </w:p>
+        </w:tc>
+        <w:tc>
+          <w:tcPr>
+            <w:tcW w:type="dxa" w:w="1587"/>
+            <w:tcBorders>
+              <w:top w:val="single" w:sz="4" w:color="CCCCCC"/>
+              <w:left w:val="single" w:sz="4" w:color="CCCCCC"/>
+              <w:bottom w:val="single" w:sz="4" w:color="CCCCCC"/>
+              <w:right w:val="single" w:sz="4" w:color="CCCCCC"/>
+            </w:tcBorders>
+          </w:tcPr>
+          <w:p>
+            <w:r>
+              <w:rPr>
+                <w:color w:val="142233"/>
+                <w:sz w:val="17"/>
+              </w:rPr>
+              <w:t>ATB-2026-27_2026-09-13_AI_BECOMES_BOTH_COLLECTION_TARGET_AND_ATTACK_PLATFORM.pdf</w:t>
+            </w:r>
+          </w:p>
+        </w:tc>
+        <w:tc>
+          <w:tcPr>
+            <w:tcW w:type="dxa" w:w="1814"/>
+            <w:tcBorders>
+              <w:top w:val="single" w:sz="4" w:color="CCCCCC"/>
+              <w:left w:val="single" w:sz="4" w:color="CCCCCC"/>
+              <w:bottom w:val="single" w:sz="4" w:color="CCCCCC"/>
+              <w:right w:val="single" w:sz="4" w:color="CCCCCC"/>
+            </w:tcBorders>
+          </w:tcPr>
+          <w:p>
+            <w:r>
+              <w:rPr>
+                <w:color w:val="142233"/>
+                <w:sz w:val="17"/>
+              </w:rPr>
+              <w:t>2026-09-13_source.html</w:t>
+            </w:r>
+          </w:p>
+        </w:tc>
+      </w:tr>
+      <w:tr>
+        <w:tc>
+          <w:tcPr>
+            <w:tcW w:type="dxa" w:w="1474"/>
+            <w:tcBorders>
+              <w:top w:val="single" w:sz="4" w:color="CCCCCC"/>
+              <w:left w:val="single" w:sz="4" w:color="CCCCCC"/>
+              <w:bottom w:val="single" w:sz="4" w:color="CCCCCC"/>
+              <w:right w:val="single" w:sz="4" w:color="CCCCCC"/>
+            </w:tcBorders>
+          </w:tcPr>
+          <w:p>
+            <w:r>
+              <w:rPr>
+                <w:color w:val="142233"/>
+                <w:sz w:val="17"/>
+              </w:rPr>
+              <w:t>ATB-2026-28</w:t>
+            </w:r>
+          </w:p>
+        </w:tc>
+        <w:tc>
+          <w:tcPr>
+            <w:tcW w:type="dxa" w:w="2551"/>
+            <w:tcBorders>
+              <w:top w:val="single" w:sz="4" w:color="CCCCCC"/>
+              <w:left w:val="single" w:sz="4" w:color="CCCCCC"/>
+              <w:bottom w:val="single" w:sz="4" w:color="CCCCCC"/>
+              <w:right w:val="single" w:sz="4" w:color="CCCCCC"/>
+            </w:tcBorders>
+          </w:tcPr>
+          <w:p>
+            <w:r>
+              <w:rPr>
+                <w:color w:val="142233"/>
+                <w:sz w:val="17"/>
+              </w:rPr>
+              <w:t>14–20 SEP 2026</w:t>
+            </w:r>
+          </w:p>
+        </w:tc>
+        <w:tc>
+          <w:tcPr>
+            <w:tcW w:type="dxa" w:w="1474"/>
+            <w:tcBorders>
+              <w:top w:val="single" w:sz="4" w:color="CCCCCC"/>
+              <w:left w:val="single" w:sz="4" w:color="CCCCCC"/>
+              <w:bottom w:val="single" w:sz="4" w:color="CCCCCC"/>
+              <w:right w:val="single" w:sz="4" w:color="CCCCCC"/>
+            </w:tcBorders>
+          </w:tcPr>
+          <w:p>
+            <w:r>
+              <w:rPr>
+                <w:color w:val="142233"/>
+                <w:sz w:val="17"/>
+              </w:rPr>
+              <w:t>2026-09-20</w:t>
+            </w:r>
+          </w:p>
+        </w:tc>
+        <w:tc>
+          <w:tcPr>
+            <w:tcW w:type="dxa" w:w="5386"/>
+            <w:tcBorders>
+              <w:top w:val="single" w:sz="4" w:color="CCCCCC"/>
+              <w:left w:val="single" w:sz="4" w:color="CCCCCC"/>
+              <w:bottom w:val="single" w:sz="4" w:color="CCCCCC"/>
+              <w:right w:val="single" w:sz="4" w:color="CCCCCC"/>
+            </w:tcBorders>
+          </w:tcPr>
+          <w:p>
+            <w:r>
+              <w:rPr>
+                <w:color w:val="142233"/>
+                <w:sz w:val="17"/>
+              </w:rPr>
+              <w:t>CONFIRMED BREACH HITS TEXAS ENERGY, NOT JUST A CLAIM</w:t>
+            </w:r>
+          </w:p>
+        </w:tc>
+        <w:tc>
+          <w:tcPr>
+            <w:tcW w:type="dxa" w:w="1587"/>
+            <w:tcBorders>
+              <w:top w:val="single" w:sz="4" w:color="CCCCCC"/>
+              <w:left w:val="single" w:sz="4" w:color="CCCCCC"/>
+              <w:bottom w:val="single" w:sz="4" w:color="CCCCCC"/>
+              <w:right w:val="single" w:sz="4" w:color="CCCCCC"/>
+            </w:tcBorders>
+          </w:tcPr>
+          <w:p>
+            <w:r>
+              <w:rPr>
+                <w:color w:val="142233"/>
+                <w:sz w:val="17"/>
+              </w:rPr>
+              <w:t>ATB-2026-28_2026-09-20_CONFIRMED_BREACH_HITS_TEXAS_ENERGY_NOT_JUST_A.docx</w:t>
+            </w:r>
+          </w:p>
+        </w:tc>
+        <w:tc>
+          <w:tcPr>
+            <w:tcW w:type="dxa" w:w="1587"/>
+            <w:tcBorders>
+              <w:top w:val="single" w:sz="4" w:color="CCCCCC"/>
+              <w:left w:val="single" w:sz="4" w:color="CCCCCC"/>
+              <w:bottom w:val="single" w:sz="4" w:color="CCCCCC"/>
+              <w:right w:val="single" w:sz="4" w:color="CCCCCC"/>
+            </w:tcBorders>
+          </w:tcPr>
+          <w:p>
+            <w:r>
+              <w:rPr>
+                <w:color w:val="142233"/>
+                <w:sz w:val="17"/>
+              </w:rPr>
+              <w:t>ATB-2026-28_2026-09-20_CONFIRMED_BREACH_HITS_TEXAS_ENERGY_NOT_JUST_A.pdf</w:t>
+            </w:r>
+          </w:p>
+        </w:tc>
+        <w:tc>
+          <w:tcPr>
+            <w:tcW w:type="dxa" w:w="1814"/>
+            <w:tcBorders>
+              <w:top w:val="single" w:sz="4" w:color="CCCCCC"/>
+              <w:left w:val="single" w:sz="4" w:color="CCCCCC"/>
+              <w:bottom w:val="single" w:sz="4" w:color="CCCCCC"/>
+              <w:right w:val="single" w:sz="4" w:color="CCCCCC"/>
+            </w:tcBorders>
+          </w:tcPr>
+          <w:p>
+            <w:r>
+              <w:rPr>
+                <w:color w:val="142233"/>
+                <w:sz w:val="17"/>
+              </w:rPr>
+              <w:t>2026-09-20_source.html</w:t>
+            </w:r>
+          </w:p>
+        </w:tc>
+      </w:tr>
+      <w:tr>
+        <w:tc>
+          <w:tcPr>
+            <w:tcW w:type="dxa" w:w="1474"/>
+            <w:tcBorders>
+              <w:top w:val="single" w:sz="4" w:color="CCCCCC"/>
+              <w:left w:val="single" w:sz="4" w:color="CCCCCC"/>
+              <w:bottom w:val="single" w:sz="4" w:color="CCCCCC"/>
+              <w:right w:val="single" w:sz="4" w:color="CCCCCC"/>
+            </w:tcBorders>
+          </w:tcPr>
+          <w:p>
+            <w:r>
+              <w:rPr>
+                <w:color w:val="142233"/>
+                <w:sz w:val="17"/>
+              </w:rPr>
               <w:t>ATB-2026-29</w:t>
             </w:r>
           </w:p>

</xml_diff>